<commit_message>
5 historias de usuario
</commit_message>
<xml_diff>
--- a/Historias_de_usuario.docx
+++ b/Historias_de_usuario.docx
@@ -3,13 +3,36 @@
 <w:document xmlns:wpc="http://schemas.microsoft.com/office/word/2010/wordprocessingCanvas" xmlns:cx="http://schemas.microsoft.com/office/drawing/2014/chartex" xmlns:cx1="http://schemas.microsoft.com/office/drawing/2015/9/8/chartex" xmlns:cx2="http://schemas.microsoft.com/office/drawing/2015/10/21/chartex" xmlns:cx3="http://schemas.microsoft.com/office/drawing/2016/5/9/chartex" xmlns:cx4="http://schemas.microsoft.com/office/drawing/2016/5/10/chartex" xmlns:cx5="http://schemas.microsoft.com/office/drawing/2016/5/11/chartex" xmlns:cx6="http://schemas.microsoft.com/office/drawing/2016/5/12/chartex" xmlns:cx7="http://schemas.microsoft.com/office/drawing/2016/5/13/chartex" xmlns:cx8="http://schemas.microsoft.com/office/drawing/2016/5/14/chartex" xmlns:mc="http://schemas.openxmlformats.org/markup-compatibility/2006" xmlns:aink="http://schemas.microsoft.com/office/drawing/2016/ink" xmlns:am3d="http://schemas.microsoft.com/office/drawing/2017/model3d" xmlns:o="urn:schemas-microsoft-com:office:office" xmlns:oel="http://schemas.microsoft.com/office/2019/extlst" xmlns:r="http://schemas.openxmlformats.org/officeDocument/2006/relationships" xmlns:m="http://schemas.openxmlformats.org/officeDocument/2006/math" xmlns:v="urn:schemas-microsoft-com:vml" xmlns:wp14="http://schemas.microsoft.com/office/word/2010/wordprocessingDrawing" xmlns:wp="http://schemas.openxmlformats.org/drawingml/2006/wordprocessingDrawing" xmlns:w10="urn:schemas-microsoft-com:office:word" xmlns:w="http://schemas.openxmlformats.org/wordprocessingml/2006/main" xmlns:w14="http://schemas.microsoft.com/office/word/2010/wordml" xmlns:w15="http://schemas.microsoft.com/office/word/2012/wordml" xmlns:w16cex="http://schemas.microsoft.com/office/word/2018/wordml/cex" xmlns:w16cid="http://schemas.microsoft.com/office/word/2016/wordml/cid" xmlns:w16="http://schemas.microsoft.com/office/word/2018/wordml" xmlns:w16du="http://schemas.microsoft.com/office/word/2023/wordml/word16du" xmlns:w16sdtdh="http://schemas.microsoft.com/office/word/2020/wordml/sdtdatahash" xmlns:w16se="http://schemas.microsoft.com/office/word/2015/wordml/symex" xmlns:wpg="http://schemas.microsoft.com/office/word/2010/wordprocessingGroup" xmlns:wpi="http://schemas.microsoft.com/office/word/2010/wordprocessingInk" xmlns:wne="http://schemas.microsoft.com/office/word/2006/wordml" xmlns:wps="http://schemas.microsoft.com/office/word/2010/wordprocessingShape" mc:Ignorable="w14 w15 w16se w16cid w16 w16cex w16sdtdh w16du wp14">
   <w:body>
     <w:p>
-      <w:r>
-        <w:t>Historia de Usuario: __</w:t>
-      </w:r>
-    </w:p>
-    <w:p>
-      <w:r>
-        <w:t>Historia de Usuario:</w:t>
+      <w:pPr>
+        <w:jc w:val="both"/>
+      </w:pPr>
+      <w:r>
+        <w:rPr>
+          <w:b/>
+          <w:bCs/>
+        </w:rPr>
+        <w:t>Actividad</w:t>
+      </w:r>
+      <w:r>
+        <w:t>: Autenticación de usuario</w:t>
+      </w:r>
+    </w:p>
+    <w:p>
+      <w:pPr>
+        <w:jc w:val="both"/>
+      </w:pPr>
+      <w:r>
+        <w:rPr>
+          <w:b/>
+          <w:bCs/>
+        </w:rPr>
+        <w:t>Historia de Usuario</w:t>
+      </w:r>
+      <w:r>
+        <w:t xml:space="preserve">: </w:t>
+      </w:r>
+      <w:r>
+        <w:t>Login de usuario</w:t>
       </w:r>
     </w:p>
     <w:p>
@@ -19,9 +42,20 @@
           <w:ilvl w:val="0"/>
           <w:numId w:val="1"/>
         </w:numPr>
-      </w:pPr>
-      <w:r>
-        <w:t>Como __</w:t>
+        <w:jc w:val="both"/>
+      </w:pPr>
+      <w:r>
+        <w:rPr>
+          <w:b/>
+          <w:bCs/>
+        </w:rPr>
+        <w:t>Como</w:t>
+      </w:r>
+      <w:r>
+        <w:t xml:space="preserve"> </w:t>
+      </w:r>
+      <w:r>
+        <w:t>usuario registrado</w:t>
       </w:r>
     </w:p>
     <w:p>
@@ -31,9 +65,27 @@
           <w:ilvl w:val="0"/>
           <w:numId w:val="1"/>
         </w:numPr>
-      </w:pPr>
-      <w:r>
-        <w:t>Quiero __</w:t>
+        <w:jc w:val="both"/>
+      </w:pPr>
+      <w:r>
+        <w:rPr>
+          <w:b/>
+          <w:bCs/>
+        </w:rPr>
+        <w:t>q</w:t>
+      </w:r>
+      <w:r>
+        <w:rPr>
+          <w:b/>
+          <w:bCs/>
+        </w:rPr>
+        <w:t>uiero</w:t>
+      </w:r>
+      <w:r>
+        <w:t xml:space="preserve"> </w:t>
+      </w:r>
+      <w:r>
+        <w:t>iniciar sesión con mi número de teléfono y contraseña</w:t>
       </w:r>
     </w:p>
     <w:p>
@@ -43,14 +95,42 @@
           <w:ilvl w:val="0"/>
           <w:numId w:val="1"/>
         </w:numPr>
-      </w:pPr>
-      <w:r>
-        <w:t>Para __</w:t>
-      </w:r>
-    </w:p>
-    <w:p>
-      <w:r>
-        <w:t>Criterios de Aceptación:</w:t>
+        <w:jc w:val="both"/>
+      </w:pPr>
+      <w:r>
+        <w:rPr>
+          <w:b/>
+          <w:bCs/>
+        </w:rPr>
+        <w:t>p</w:t>
+      </w:r>
+      <w:r>
+        <w:rPr>
+          <w:b/>
+          <w:bCs/>
+        </w:rPr>
+        <w:t>ara</w:t>
+      </w:r>
+      <w:r>
+        <w:t xml:space="preserve"> </w:t>
+      </w:r>
+      <w:r>
+        <w:t>poder utilizar la aplicación de intercambio de mensajes</w:t>
+      </w:r>
+    </w:p>
+    <w:p>
+      <w:pPr>
+        <w:jc w:val="both"/>
+      </w:pPr>
+      <w:r>
+        <w:rPr>
+          <w:b/>
+          <w:bCs/>
+        </w:rPr>
+        <w:t>Criterios de Aceptación</w:t>
+      </w:r>
+      <w:r>
+        <w:t>:</w:t>
       </w:r>
     </w:p>
     <w:p>
@@ -60,45 +140,103 @@
           <w:ilvl w:val="0"/>
           <w:numId w:val="2"/>
         </w:numPr>
-      </w:pPr>
-      <w:r>
-        <w:t>Criterio de Visualización de __:</w:t>
-      </w:r>
-    </w:p>
-    <w:p>
-      <w:pPr>
-        <w:pStyle w:val="Prrafodelista"/>
-        <w:numPr>
-          <w:ilvl w:val="1"/>
-          <w:numId w:val="1"/>
-        </w:numPr>
-      </w:pPr>
-      <w:r>
-        <w:t>Dado __</w:t>
-      </w:r>
-    </w:p>
-    <w:p>
-      <w:pPr>
-        <w:pStyle w:val="Prrafodelista"/>
-        <w:numPr>
-          <w:ilvl w:val="1"/>
-          <w:numId w:val="1"/>
-        </w:numPr>
-      </w:pPr>
-      <w:r>
-        <w:t>Cuando __</w:t>
-      </w:r>
-    </w:p>
-    <w:p>
-      <w:pPr>
-        <w:pStyle w:val="Prrafodelista"/>
-        <w:numPr>
-          <w:ilvl w:val="1"/>
-          <w:numId w:val="1"/>
-        </w:numPr>
-      </w:pPr>
-      <w:r>
-        <w:t>Entonces __</w:t>
+        <w:jc w:val="both"/>
+      </w:pPr>
+      <w:r>
+        <w:t>Datos correctos</w:t>
+      </w:r>
+      <w:r>
+        <w:t>:</w:t>
+      </w:r>
+    </w:p>
+    <w:p>
+      <w:pPr>
+        <w:pStyle w:val="Prrafodelista"/>
+        <w:numPr>
+          <w:ilvl w:val="1"/>
+          <w:numId w:val="1"/>
+        </w:numPr>
+        <w:jc w:val="both"/>
+      </w:pPr>
+      <w:r>
+        <w:rPr>
+          <w:b/>
+          <w:bCs/>
+        </w:rPr>
+        <w:t xml:space="preserve">Dado </w:t>
+      </w:r>
+      <w:r>
+        <w:rPr>
+          <w:b/>
+          <w:bCs/>
+        </w:rPr>
+        <w:t>que</w:t>
+      </w:r>
+      <w:r>
+        <w:t xml:space="preserve"> el usuario accede a la ventana de login</w:t>
+      </w:r>
+    </w:p>
+    <w:p>
+      <w:pPr>
+        <w:pStyle w:val="Prrafodelista"/>
+        <w:numPr>
+          <w:ilvl w:val="1"/>
+          <w:numId w:val="1"/>
+        </w:numPr>
+        <w:jc w:val="both"/>
+      </w:pPr>
+      <w:r>
+        <w:rPr>
+          <w:b/>
+          <w:bCs/>
+        </w:rPr>
+        <w:t>c</w:t>
+      </w:r>
+      <w:r>
+        <w:rPr>
+          <w:b/>
+          <w:bCs/>
+        </w:rPr>
+        <w:t>uando</w:t>
+      </w:r>
+      <w:r>
+        <w:t xml:space="preserve"> </w:t>
+      </w:r>
+      <w:r>
+        <w:t>introduce los datos correctos</w:t>
+      </w:r>
+      <w:r>
+        <w:t>,</w:t>
+      </w:r>
+    </w:p>
+    <w:p>
+      <w:pPr>
+        <w:pStyle w:val="Prrafodelista"/>
+        <w:numPr>
+          <w:ilvl w:val="1"/>
+          <w:numId w:val="1"/>
+        </w:numPr>
+        <w:jc w:val="both"/>
+      </w:pPr>
+      <w:r>
+        <w:rPr>
+          <w:b/>
+          <w:bCs/>
+        </w:rPr>
+        <w:t>e</w:t>
+      </w:r>
+      <w:r>
+        <w:rPr>
+          <w:b/>
+          <w:bCs/>
+        </w:rPr>
+        <w:t>ntonces</w:t>
+      </w:r>
+      <w:r>
+        <w:t xml:space="preserve"> </w:t>
+      </w:r>
+      <w:r>
+        <w:t>inicia sesión con dichos datos y sus mensajes y contactos</w:t>
       </w:r>
     </w:p>
     <w:p>
@@ -108,45 +246,143 @@
           <w:ilvl w:val="0"/>
           <w:numId w:val="2"/>
         </w:numPr>
-      </w:pPr>
-      <w:r>
-        <w:t>Criterio de Validación de __:</w:t>
-      </w:r>
-    </w:p>
-    <w:p>
-      <w:pPr>
-        <w:pStyle w:val="Prrafodelista"/>
-        <w:numPr>
-          <w:ilvl w:val="1"/>
-          <w:numId w:val="1"/>
-        </w:numPr>
-      </w:pPr>
-      <w:r>
-        <w:t>Dado __</w:t>
-      </w:r>
-    </w:p>
-    <w:p>
-      <w:pPr>
-        <w:pStyle w:val="Prrafodelista"/>
-        <w:numPr>
-          <w:ilvl w:val="1"/>
-          <w:numId w:val="1"/>
-        </w:numPr>
-      </w:pPr>
-      <w:r>
-        <w:t>Cuando __</w:t>
-      </w:r>
-    </w:p>
-    <w:p>
-      <w:pPr>
-        <w:pStyle w:val="Prrafodelista"/>
-        <w:numPr>
-          <w:ilvl w:val="1"/>
-          <w:numId w:val="1"/>
-        </w:numPr>
-      </w:pPr>
-      <w:r>
-        <w:t>Entonces __</w:t>
+        <w:jc w:val="both"/>
+      </w:pPr>
+      <w:r>
+        <w:t>Datos incorrectos</w:t>
+      </w:r>
+      <w:r>
+        <w:t>:</w:t>
+      </w:r>
+    </w:p>
+    <w:p>
+      <w:pPr>
+        <w:pStyle w:val="Prrafodelista"/>
+        <w:numPr>
+          <w:ilvl w:val="1"/>
+          <w:numId w:val="1"/>
+        </w:numPr>
+        <w:jc w:val="both"/>
+        <w:rPr>
+          <w:b/>
+          <w:bCs/>
+        </w:rPr>
+      </w:pPr>
+      <w:r>
+        <w:rPr>
+          <w:b/>
+          <w:bCs/>
+        </w:rPr>
+        <w:t xml:space="preserve">Dado </w:t>
+      </w:r>
+      <w:r>
+        <w:rPr>
+          <w:b/>
+          <w:bCs/>
+        </w:rPr>
+        <w:t xml:space="preserve">que </w:t>
+      </w:r>
+      <w:r>
+        <w:t>el usuario no ha completado los campos correctamente</w:t>
+      </w:r>
+    </w:p>
+    <w:p>
+      <w:pPr>
+        <w:pStyle w:val="Prrafodelista"/>
+        <w:numPr>
+          <w:ilvl w:val="1"/>
+          <w:numId w:val="1"/>
+        </w:numPr>
+        <w:jc w:val="both"/>
+      </w:pPr>
+      <w:r>
+        <w:rPr>
+          <w:b/>
+          <w:bCs/>
+        </w:rPr>
+        <w:t>c</w:t>
+      </w:r>
+      <w:r>
+        <w:rPr>
+          <w:b/>
+          <w:bCs/>
+        </w:rPr>
+        <w:t>uando</w:t>
+      </w:r>
+      <w:r>
+        <w:t xml:space="preserve"> </w:t>
+      </w:r>
+      <w:r>
+        <w:t>intenta logearse</w:t>
+      </w:r>
+      <w:r>
+        <w:t>,</w:t>
+      </w:r>
+    </w:p>
+    <w:p>
+      <w:pPr>
+        <w:pStyle w:val="Prrafodelista"/>
+        <w:numPr>
+          <w:ilvl w:val="1"/>
+          <w:numId w:val="1"/>
+        </w:numPr>
+        <w:jc w:val="both"/>
+      </w:pPr>
+      <w:r>
+        <w:rPr>
+          <w:b/>
+          <w:bCs/>
+        </w:rPr>
+        <w:t>e</w:t>
+      </w:r>
+      <w:r>
+        <w:rPr>
+          <w:b/>
+          <w:bCs/>
+        </w:rPr>
+        <w:t>ntonces</w:t>
+      </w:r>
+      <w:r>
+        <w:t xml:space="preserve"> </w:t>
+      </w:r>
+      <w:r>
+        <w:t>el sistema debe mostrar mensajes de error para los campos incorrectos o faltantes</w:t>
+      </w:r>
+    </w:p>
+    <w:p>
+      <w:pPr>
+        <w:jc w:val="both"/>
+      </w:pPr>
+      <w:r>
+        <w:rPr>
+          <w:b/>
+          <w:bCs/>
+        </w:rPr>
+        <w:t>Actividad</w:t>
+      </w:r>
+      <w:r>
+        <w:t xml:space="preserve">: </w:t>
+      </w:r>
+      <w:r>
+        <w:t>Gestionar contactos</w:t>
+      </w:r>
+    </w:p>
+    <w:p>
+      <w:pPr>
+        <w:jc w:val="both"/>
+      </w:pPr>
+      <w:r>
+        <w:rPr>
+          <w:b/>
+          <w:bCs/>
+        </w:rPr>
+        <w:t>Historia de Usuario</w:t>
+      </w:r>
+      <w:r>
+        <w:t xml:space="preserve">: </w:t>
+      </w:r>
+      <w:r>
+        <w:t>Añadir contacto</w:t>
       </w:r>
     </w:p>
     <w:p>
@@ -154,48 +390,1664 @@
         <w:pStyle w:val="Prrafodelista"/>
         <w:numPr>
           <w:ilvl w:val="0"/>
-          <w:numId w:val="2"/>
-        </w:numPr>
-      </w:pPr>
-      <w:r>
-        <w:t>Criterio de Confirmación de __:</w:t>
-      </w:r>
-    </w:p>
-    <w:p>
-      <w:pPr>
-        <w:pStyle w:val="Prrafodelista"/>
-        <w:numPr>
-          <w:ilvl w:val="1"/>
-          <w:numId w:val="1"/>
-        </w:numPr>
-      </w:pPr>
-      <w:r>
-        <w:t>Dado __</w:t>
-      </w:r>
-    </w:p>
-    <w:p>
-      <w:pPr>
-        <w:pStyle w:val="Prrafodelista"/>
-        <w:numPr>
-          <w:ilvl w:val="1"/>
-          <w:numId w:val="1"/>
-        </w:numPr>
-      </w:pPr>
-      <w:r>
-        <w:t>Cuando __</w:t>
-      </w:r>
-    </w:p>
-    <w:p>
-      <w:pPr>
-        <w:pStyle w:val="Prrafodelista"/>
-        <w:numPr>
-          <w:ilvl w:val="1"/>
-          <w:numId w:val="1"/>
-        </w:numPr>
-      </w:pPr>
-      <w:r>
-        <w:t>Entonces __</w:t>
-      </w:r>
+          <w:numId w:val="1"/>
+        </w:numPr>
+        <w:jc w:val="both"/>
+      </w:pPr>
+      <w:r>
+        <w:rPr>
+          <w:b/>
+          <w:bCs/>
+        </w:rPr>
+        <w:t>Como</w:t>
+      </w:r>
+      <w:r>
+        <w:t xml:space="preserve"> usuario </w:t>
+      </w:r>
+      <w:r>
+        <w:t>identificado</w:t>
+      </w:r>
+    </w:p>
+    <w:p>
+      <w:pPr>
+        <w:pStyle w:val="Prrafodelista"/>
+        <w:numPr>
+          <w:ilvl w:val="0"/>
+          <w:numId w:val="1"/>
+        </w:numPr>
+        <w:jc w:val="both"/>
+      </w:pPr>
+      <w:r>
+        <w:rPr>
+          <w:b/>
+          <w:bCs/>
+        </w:rPr>
+        <w:t>q</w:t>
+      </w:r>
+      <w:r>
+        <w:rPr>
+          <w:b/>
+          <w:bCs/>
+        </w:rPr>
+        <w:t>uiero</w:t>
+      </w:r>
+      <w:r>
+        <w:t xml:space="preserve"> </w:t>
+      </w:r>
+      <w:r>
+        <w:t>añadir un nuevo contacto a mi lista de contactos</w:t>
+      </w:r>
+    </w:p>
+    <w:p>
+      <w:pPr>
+        <w:pStyle w:val="Prrafodelista"/>
+        <w:numPr>
+          <w:ilvl w:val="0"/>
+          <w:numId w:val="1"/>
+        </w:numPr>
+        <w:jc w:val="both"/>
+      </w:pPr>
+      <w:r>
+        <w:rPr>
+          <w:b/>
+          <w:bCs/>
+        </w:rPr>
+        <w:t>p</w:t>
+      </w:r>
+      <w:r>
+        <w:rPr>
+          <w:b/>
+          <w:bCs/>
+        </w:rPr>
+        <w:t>ara</w:t>
+      </w:r>
+      <w:r>
+        <w:t xml:space="preserve"> poder </w:t>
+      </w:r>
+      <w:r>
+        <w:t>acceder a él mediante un nombre de contacto</w:t>
+      </w:r>
+    </w:p>
+    <w:p>
+      <w:pPr>
+        <w:jc w:val="both"/>
+      </w:pPr>
+      <w:r>
+        <w:rPr>
+          <w:b/>
+          <w:bCs/>
+        </w:rPr>
+        <w:t>Criterios de Aceptación</w:t>
+      </w:r>
+      <w:r>
+        <w:t>:</w:t>
+      </w:r>
+    </w:p>
+    <w:p>
+      <w:pPr>
+        <w:pStyle w:val="Prrafodelista"/>
+        <w:numPr>
+          <w:ilvl w:val="0"/>
+          <w:numId w:val="3"/>
+        </w:numPr>
+        <w:jc w:val="both"/>
+      </w:pPr>
+      <w:r>
+        <w:t>Datos correctos:</w:t>
+      </w:r>
+    </w:p>
+    <w:p>
+      <w:pPr>
+        <w:pStyle w:val="Prrafodelista"/>
+        <w:numPr>
+          <w:ilvl w:val="1"/>
+          <w:numId w:val="1"/>
+        </w:numPr>
+        <w:jc w:val="both"/>
+      </w:pPr>
+      <w:r>
+        <w:rPr>
+          <w:b/>
+          <w:bCs/>
+        </w:rPr>
+        <w:t>Dado que</w:t>
+      </w:r>
+      <w:r>
+        <w:t xml:space="preserve"> </w:t>
+      </w:r>
+      <w:r>
+        <w:t>el usuario quiere añadir un nuevo contacto</w:t>
+      </w:r>
+    </w:p>
+    <w:p>
+      <w:pPr>
+        <w:pStyle w:val="Prrafodelista"/>
+        <w:numPr>
+          <w:ilvl w:val="1"/>
+          <w:numId w:val="1"/>
+        </w:numPr>
+        <w:jc w:val="both"/>
+      </w:pPr>
+      <w:r>
+        <w:rPr>
+          <w:b/>
+          <w:bCs/>
+        </w:rPr>
+        <w:t>cuando</w:t>
+      </w:r>
+      <w:r>
+        <w:t xml:space="preserve"> </w:t>
+      </w:r>
+      <w:r>
+        <w:t>introduce un número y un nombre de contacto no incluidos en la lista</w:t>
+      </w:r>
+      <w:r>
+        <w:t>,</w:t>
+      </w:r>
+    </w:p>
+    <w:p>
+      <w:pPr>
+        <w:pStyle w:val="Prrafodelista"/>
+        <w:numPr>
+          <w:ilvl w:val="1"/>
+          <w:numId w:val="1"/>
+        </w:numPr>
+        <w:jc w:val="both"/>
+      </w:pPr>
+      <w:r>
+        <w:rPr>
+          <w:b/>
+          <w:bCs/>
+        </w:rPr>
+        <w:t>entonces</w:t>
+      </w:r>
+      <w:r>
+        <w:t xml:space="preserve"> </w:t>
+      </w:r>
+      <w:r>
+        <w:t>se añade el contacto</w:t>
+      </w:r>
+    </w:p>
+    <w:p>
+      <w:pPr>
+        <w:pStyle w:val="Prrafodelista"/>
+        <w:numPr>
+          <w:ilvl w:val="0"/>
+          <w:numId w:val="3"/>
+        </w:numPr>
+        <w:jc w:val="both"/>
+      </w:pPr>
+      <w:r>
+        <w:t>Número ya está en la lista</w:t>
+      </w:r>
+      <w:r>
+        <w:t>:</w:t>
+      </w:r>
+    </w:p>
+    <w:p>
+      <w:pPr>
+        <w:pStyle w:val="Prrafodelista"/>
+        <w:numPr>
+          <w:ilvl w:val="1"/>
+          <w:numId w:val="1"/>
+        </w:numPr>
+        <w:jc w:val="both"/>
+        <w:rPr>
+          <w:b/>
+          <w:bCs/>
+        </w:rPr>
+      </w:pPr>
+      <w:r>
+        <w:rPr>
+          <w:b/>
+          <w:bCs/>
+        </w:rPr>
+        <w:t xml:space="preserve">Dado que </w:t>
+      </w:r>
+      <w:r>
+        <w:t>el usuario quiere añadir un nuevo contacto</w:t>
+      </w:r>
+    </w:p>
+    <w:p>
+      <w:pPr>
+        <w:pStyle w:val="Prrafodelista"/>
+        <w:numPr>
+          <w:ilvl w:val="1"/>
+          <w:numId w:val="1"/>
+        </w:numPr>
+        <w:jc w:val="both"/>
+      </w:pPr>
+      <w:r>
+        <w:rPr>
+          <w:b/>
+          <w:bCs/>
+        </w:rPr>
+        <w:t>cuando</w:t>
+      </w:r>
+      <w:r>
+        <w:t xml:space="preserve"> </w:t>
+      </w:r>
+      <w:r>
+        <w:t>introduce un número, y este ya se encuentra en su lista de contactos</w:t>
+      </w:r>
+      <w:r>
+        <w:t>,</w:t>
+      </w:r>
+    </w:p>
+    <w:p>
+      <w:pPr>
+        <w:pStyle w:val="Prrafodelista"/>
+        <w:numPr>
+          <w:ilvl w:val="1"/>
+          <w:numId w:val="1"/>
+        </w:numPr>
+        <w:jc w:val="both"/>
+      </w:pPr>
+      <w:r>
+        <w:rPr>
+          <w:b/>
+          <w:bCs/>
+        </w:rPr>
+        <w:t>entonces</w:t>
+      </w:r>
+      <w:r>
+        <w:t xml:space="preserve"> el sistema debe mostrar mensajes de error</w:t>
+      </w:r>
+    </w:p>
+    <w:p>
+      <w:pPr>
+        <w:pStyle w:val="Prrafodelista"/>
+        <w:numPr>
+          <w:ilvl w:val="0"/>
+          <w:numId w:val="3"/>
+        </w:numPr>
+        <w:jc w:val="both"/>
+      </w:pPr>
+      <w:r>
+        <w:t xml:space="preserve">Número </w:t>
+      </w:r>
+      <w:r>
+        <w:t>no existe</w:t>
+      </w:r>
+      <w:r>
+        <w:t>:</w:t>
+      </w:r>
+    </w:p>
+    <w:p>
+      <w:pPr>
+        <w:pStyle w:val="Prrafodelista"/>
+        <w:numPr>
+          <w:ilvl w:val="1"/>
+          <w:numId w:val="1"/>
+        </w:numPr>
+        <w:jc w:val="both"/>
+        <w:rPr>
+          <w:b/>
+          <w:bCs/>
+        </w:rPr>
+      </w:pPr>
+      <w:r>
+        <w:rPr>
+          <w:b/>
+          <w:bCs/>
+        </w:rPr>
+        <w:t xml:space="preserve">Dado que </w:t>
+      </w:r>
+      <w:r>
+        <w:t>el usuario quiere añadir un nuevo contacto</w:t>
+      </w:r>
+    </w:p>
+    <w:p>
+      <w:pPr>
+        <w:pStyle w:val="Prrafodelista"/>
+        <w:numPr>
+          <w:ilvl w:val="1"/>
+          <w:numId w:val="1"/>
+        </w:numPr>
+        <w:jc w:val="both"/>
+      </w:pPr>
+      <w:r>
+        <w:rPr>
+          <w:b/>
+          <w:bCs/>
+        </w:rPr>
+        <w:t>cuando</w:t>
+      </w:r>
+      <w:r>
+        <w:t xml:space="preserve"> </w:t>
+      </w:r>
+      <w:r>
+        <w:t>introduce un número y este no existe,</w:t>
+      </w:r>
+    </w:p>
+    <w:p>
+      <w:pPr>
+        <w:pStyle w:val="Prrafodelista"/>
+        <w:numPr>
+          <w:ilvl w:val="1"/>
+          <w:numId w:val="1"/>
+        </w:numPr>
+        <w:jc w:val="both"/>
+      </w:pPr>
+      <w:r>
+        <w:rPr>
+          <w:b/>
+          <w:bCs/>
+        </w:rPr>
+        <w:t>entonces</w:t>
+      </w:r>
+      <w:r>
+        <w:t xml:space="preserve"> el sistema debe mostrar mensajes de error</w:t>
+      </w:r>
+    </w:p>
+    <w:p>
+      <w:pPr>
+        <w:pStyle w:val="Prrafodelista"/>
+        <w:numPr>
+          <w:ilvl w:val="0"/>
+          <w:numId w:val="3"/>
+        </w:numPr>
+        <w:jc w:val="both"/>
+      </w:pPr>
+      <w:r>
+        <w:t>Nombre ya asignado:</w:t>
+      </w:r>
+    </w:p>
+    <w:p>
+      <w:pPr>
+        <w:pStyle w:val="Prrafodelista"/>
+        <w:numPr>
+          <w:ilvl w:val="1"/>
+          <w:numId w:val="1"/>
+        </w:numPr>
+        <w:jc w:val="both"/>
+        <w:rPr>
+          <w:b/>
+          <w:bCs/>
+        </w:rPr>
+      </w:pPr>
+      <w:r>
+        <w:rPr>
+          <w:b/>
+          <w:bCs/>
+        </w:rPr>
+        <w:t xml:space="preserve">Dado que </w:t>
+      </w:r>
+      <w:r>
+        <w:t>el usuario quiere añadir un nuevo contacto</w:t>
+      </w:r>
+    </w:p>
+    <w:p>
+      <w:pPr>
+        <w:pStyle w:val="Prrafodelista"/>
+        <w:numPr>
+          <w:ilvl w:val="1"/>
+          <w:numId w:val="1"/>
+        </w:numPr>
+        <w:jc w:val="both"/>
+        <w:rPr>
+          <w:b/>
+          <w:bCs/>
+        </w:rPr>
+      </w:pPr>
+      <w:r>
+        <w:rPr>
+          <w:b/>
+          <w:bCs/>
+        </w:rPr>
+        <w:t>cuando</w:t>
+      </w:r>
+      <w:r>
+        <w:t xml:space="preserve"> el nombre introducido ya está en la lista de contactos,</w:t>
+      </w:r>
+    </w:p>
+    <w:p>
+      <w:pPr>
+        <w:pStyle w:val="Prrafodelista"/>
+        <w:numPr>
+          <w:ilvl w:val="1"/>
+          <w:numId w:val="1"/>
+        </w:numPr>
+        <w:jc w:val="both"/>
+        <w:rPr>
+          <w:b/>
+          <w:bCs/>
+        </w:rPr>
+      </w:pPr>
+      <w:r>
+        <w:rPr>
+          <w:b/>
+          <w:bCs/>
+        </w:rPr>
+        <w:t>entonces</w:t>
+      </w:r>
+      <w:r>
+        <w:t xml:space="preserve"> </w:t>
+      </w:r>
+      <w:r>
+        <w:t>el sistema debe mostrar mensajes de error</w:t>
+      </w:r>
+    </w:p>
+    <w:p>
+      <w:pPr>
+        <w:jc w:val="both"/>
+        <w:rPr>
+          <w:b/>
+          <w:bCs/>
+        </w:rPr>
+      </w:pPr>
+    </w:p>
+    <w:p>
+      <w:pPr>
+        <w:jc w:val="both"/>
+        <w:rPr>
+          <w:b/>
+          <w:bCs/>
+        </w:rPr>
+      </w:pPr>
+    </w:p>
+    <w:p>
+      <w:pPr>
+        <w:jc w:val="both"/>
+      </w:pPr>
+      <w:r>
+        <w:rPr>
+          <w:b/>
+          <w:bCs/>
+        </w:rPr>
+        <w:lastRenderedPageBreak/>
+        <w:t>Actividad</w:t>
+      </w:r>
+      <w:r>
+        <w:t xml:space="preserve">: </w:t>
+      </w:r>
+      <w:r>
+        <w:t>Intercambio de mensajes</w:t>
+      </w:r>
+    </w:p>
+    <w:p>
+      <w:pPr>
+        <w:jc w:val="both"/>
+      </w:pPr>
+      <w:r>
+        <w:rPr>
+          <w:b/>
+          <w:bCs/>
+        </w:rPr>
+        <w:t>Historia de Usuario</w:t>
+      </w:r>
+      <w:r>
+        <w:t xml:space="preserve">: </w:t>
+      </w:r>
+      <w:r>
+        <w:t>Enviar mensaje a contacto</w:t>
+      </w:r>
+    </w:p>
+    <w:p>
+      <w:pPr>
+        <w:pStyle w:val="Prrafodelista"/>
+        <w:numPr>
+          <w:ilvl w:val="0"/>
+          <w:numId w:val="1"/>
+        </w:numPr>
+        <w:jc w:val="both"/>
+      </w:pPr>
+      <w:r>
+        <w:rPr>
+          <w:b/>
+          <w:bCs/>
+        </w:rPr>
+        <w:t>Como</w:t>
+      </w:r>
+      <w:r>
+        <w:t xml:space="preserve"> usuario </w:t>
+      </w:r>
+      <w:r>
+        <w:t>identificado</w:t>
+      </w:r>
+    </w:p>
+    <w:p>
+      <w:pPr>
+        <w:pStyle w:val="Prrafodelista"/>
+        <w:numPr>
+          <w:ilvl w:val="0"/>
+          <w:numId w:val="1"/>
+        </w:numPr>
+        <w:jc w:val="both"/>
+      </w:pPr>
+      <w:r>
+        <w:rPr>
+          <w:b/>
+          <w:bCs/>
+        </w:rPr>
+        <w:t>q</w:t>
+      </w:r>
+      <w:r>
+        <w:rPr>
+          <w:b/>
+          <w:bCs/>
+        </w:rPr>
+        <w:t>uiero</w:t>
+      </w:r>
+      <w:r>
+        <w:t xml:space="preserve"> </w:t>
+      </w:r>
+      <w:r>
+        <w:t>seleccionar un contacto</w:t>
+      </w:r>
+    </w:p>
+    <w:p>
+      <w:pPr>
+        <w:pStyle w:val="Prrafodelista"/>
+        <w:numPr>
+          <w:ilvl w:val="0"/>
+          <w:numId w:val="1"/>
+        </w:numPr>
+        <w:jc w:val="both"/>
+      </w:pPr>
+      <w:r>
+        <w:rPr>
+          <w:b/>
+          <w:bCs/>
+        </w:rPr>
+        <w:t>p</w:t>
+      </w:r>
+      <w:r>
+        <w:rPr>
+          <w:b/>
+          <w:bCs/>
+        </w:rPr>
+        <w:t>ara</w:t>
+      </w:r>
+      <w:r>
+        <w:t xml:space="preserve"> </w:t>
+      </w:r>
+      <w:r>
+        <w:t>mandarle un mensaje</w:t>
+      </w:r>
+    </w:p>
+    <w:p>
+      <w:pPr>
+        <w:jc w:val="both"/>
+      </w:pPr>
+      <w:r>
+        <w:rPr>
+          <w:b/>
+          <w:bCs/>
+        </w:rPr>
+        <w:t>Criterios de Aceptación</w:t>
+      </w:r>
+      <w:r>
+        <w:t>:</w:t>
+      </w:r>
+    </w:p>
+    <w:p>
+      <w:pPr>
+        <w:pStyle w:val="Prrafodelista"/>
+        <w:numPr>
+          <w:ilvl w:val="0"/>
+          <w:numId w:val="4"/>
+        </w:numPr>
+        <w:jc w:val="both"/>
+      </w:pPr>
+      <w:r>
+        <w:t>Mensaje válido</w:t>
+      </w:r>
+      <w:r>
+        <w:t>:</w:t>
+      </w:r>
+    </w:p>
+    <w:p>
+      <w:pPr>
+        <w:pStyle w:val="Prrafodelista"/>
+        <w:numPr>
+          <w:ilvl w:val="1"/>
+          <w:numId w:val="1"/>
+        </w:numPr>
+        <w:jc w:val="both"/>
+      </w:pPr>
+      <w:r>
+        <w:rPr>
+          <w:b/>
+          <w:bCs/>
+        </w:rPr>
+        <w:t>Dado que</w:t>
+      </w:r>
+      <w:r>
+        <w:t xml:space="preserve"> el usuario </w:t>
+      </w:r>
+      <w:r>
+        <w:t>quiere enviar un mensaje a un contacto</w:t>
+      </w:r>
+    </w:p>
+    <w:p>
+      <w:pPr>
+        <w:pStyle w:val="Prrafodelista"/>
+        <w:numPr>
+          <w:ilvl w:val="1"/>
+          <w:numId w:val="1"/>
+        </w:numPr>
+        <w:jc w:val="both"/>
+      </w:pPr>
+      <w:r>
+        <w:rPr>
+          <w:b/>
+          <w:bCs/>
+        </w:rPr>
+        <w:t>cuando</w:t>
+      </w:r>
+      <w:r>
+        <w:t xml:space="preserve"> </w:t>
+      </w:r>
+      <w:r>
+        <w:t>ya lo ha escrito y le da a enviar,</w:t>
+      </w:r>
+    </w:p>
+    <w:p>
+      <w:pPr>
+        <w:pStyle w:val="Prrafodelista"/>
+        <w:numPr>
+          <w:ilvl w:val="1"/>
+          <w:numId w:val="1"/>
+        </w:numPr>
+        <w:jc w:val="both"/>
+      </w:pPr>
+      <w:r>
+        <w:rPr>
+          <w:b/>
+          <w:bCs/>
+        </w:rPr>
+        <w:t>entonces</w:t>
+      </w:r>
+      <w:r>
+        <w:t xml:space="preserve"> </w:t>
+      </w:r>
+      <w:r>
+        <w:t>el sistema envía el mensaje</w:t>
+      </w:r>
+    </w:p>
+    <w:p>
+      <w:pPr>
+        <w:pStyle w:val="Prrafodelista"/>
+        <w:numPr>
+          <w:ilvl w:val="0"/>
+          <w:numId w:val="4"/>
+        </w:numPr>
+        <w:jc w:val="both"/>
+      </w:pPr>
+      <w:r>
+        <w:t xml:space="preserve">Mensaje </w:t>
+      </w:r>
+      <w:r>
+        <w:t>no válido</w:t>
+      </w:r>
+      <w:r>
+        <w:t>:</w:t>
+      </w:r>
+    </w:p>
+    <w:p>
+      <w:pPr>
+        <w:pStyle w:val="Prrafodelista"/>
+        <w:numPr>
+          <w:ilvl w:val="1"/>
+          <w:numId w:val="1"/>
+        </w:numPr>
+        <w:jc w:val="both"/>
+      </w:pPr>
+      <w:r>
+        <w:rPr>
+          <w:b/>
+          <w:bCs/>
+        </w:rPr>
+        <w:t>Dado que</w:t>
+      </w:r>
+      <w:r>
+        <w:t xml:space="preserve"> el usuario </w:t>
+      </w:r>
+      <w:r>
+        <w:t>quiere enviar un mensaje a un contacto</w:t>
+      </w:r>
+    </w:p>
+    <w:p>
+      <w:pPr>
+        <w:pStyle w:val="Prrafodelista"/>
+        <w:numPr>
+          <w:ilvl w:val="1"/>
+          <w:numId w:val="1"/>
+        </w:numPr>
+        <w:jc w:val="both"/>
+      </w:pPr>
+      <w:r>
+        <w:rPr>
+          <w:b/>
+          <w:bCs/>
+        </w:rPr>
+        <w:t>cuando</w:t>
+      </w:r>
+      <w:r>
+        <w:t xml:space="preserve"> </w:t>
+      </w:r>
+      <w:r>
+        <w:t>le da a enviar sin haber escrito nada,</w:t>
+      </w:r>
+    </w:p>
+    <w:p>
+      <w:pPr>
+        <w:pStyle w:val="Prrafodelista"/>
+        <w:numPr>
+          <w:ilvl w:val="1"/>
+          <w:numId w:val="1"/>
+        </w:numPr>
+        <w:jc w:val="both"/>
+      </w:pPr>
+      <w:r>
+        <w:rPr>
+          <w:b/>
+          <w:bCs/>
+        </w:rPr>
+        <w:t>entonces</w:t>
+      </w:r>
+      <w:r>
+        <w:t xml:space="preserve"> </w:t>
+      </w:r>
+      <w:r>
+        <w:t xml:space="preserve">el sistema </w:t>
+      </w:r>
+      <w:r>
+        <w:t>ignora la acción</w:t>
+      </w:r>
+    </w:p>
+    <w:p>
+      <w:pPr>
+        <w:jc w:val="both"/>
+      </w:pPr>
+    </w:p>
+    <w:p>
+      <w:pPr>
+        <w:jc w:val="both"/>
+      </w:pPr>
+      <w:r>
+        <w:rPr>
+          <w:b/>
+          <w:bCs/>
+        </w:rPr>
+        <w:t>Actividad</w:t>
+      </w:r>
+      <w:r>
+        <w:t xml:space="preserve">: </w:t>
+      </w:r>
+      <w:r>
+        <w:t>Explorar mensajes</w:t>
+      </w:r>
+    </w:p>
+    <w:p>
+      <w:pPr>
+        <w:jc w:val="both"/>
+      </w:pPr>
+      <w:r>
+        <w:rPr>
+          <w:b/>
+          <w:bCs/>
+        </w:rPr>
+        <w:t>Historia de Usuario</w:t>
+      </w:r>
+      <w:r>
+        <w:t xml:space="preserve">: </w:t>
+      </w:r>
+      <w:r>
+        <w:t>Aplicar filtros</w:t>
+      </w:r>
+    </w:p>
+    <w:p>
+      <w:pPr>
+        <w:pStyle w:val="Prrafodelista"/>
+        <w:numPr>
+          <w:ilvl w:val="0"/>
+          <w:numId w:val="1"/>
+        </w:numPr>
+        <w:jc w:val="both"/>
+      </w:pPr>
+      <w:r>
+        <w:rPr>
+          <w:b/>
+          <w:bCs/>
+        </w:rPr>
+        <w:t>Como</w:t>
+      </w:r>
+      <w:r>
+        <w:t xml:space="preserve"> usuario identificado</w:t>
+      </w:r>
+    </w:p>
+    <w:p>
+      <w:pPr>
+        <w:pStyle w:val="Prrafodelista"/>
+        <w:numPr>
+          <w:ilvl w:val="0"/>
+          <w:numId w:val="1"/>
+        </w:numPr>
+        <w:jc w:val="both"/>
+      </w:pPr>
+      <w:r>
+        <w:rPr>
+          <w:b/>
+          <w:bCs/>
+        </w:rPr>
+        <w:t>q</w:t>
+      </w:r>
+      <w:r>
+        <w:rPr>
+          <w:b/>
+          <w:bCs/>
+        </w:rPr>
+        <w:t>uiero</w:t>
+      </w:r>
+      <w:r>
+        <w:t xml:space="preserve"> </w:t>
+      </w:r>
+      <w:r>
+        <w:t>aplicar un filtro</w:t>
+      </w:r>
+    </w:p>
+    <w:p>
+      <w:pPr>
+        <w:pStyle w:val="Prrafodelista"/>
+        <w:numPr>
+          <w:ilvl w:val="0"/>
+          <w:numId w:val="1"/>
+        </w:numPr>
+        <w:jc w:val="both"/>
+      </w:pPr>
+      <w:r>
+        <w:rPr>
+          <w:b/>
+          <w:bCs/>
+        </w:rPr>
+        <w:t>p</w:t>
+      </w:r>
+      <w:r>
+        <w:rPr>
+          <w:b/>
+          <w:bCs/>
+        </w:rPr>
+        <w:t>ara</w:t>
+      </w:r>
+      <w:r>
+        <w:t xml:space="preserve"> </w:t>
+      </w:r>
+      <w:r>
+        <w:t>buscar un mensaje</w:t>
+      </w:r>
+    </w:p>
+    <w:p>
+      <w:pPr>
+        <w:jc w:val="both"/>
+      </w:pPr>
+      <w:r>
+        <w:rPr>
+          <w:b/>
+          <w:bCs/>
+        </w:rPr>
+        <w:t>Criterios de Aceptación</w:t>
+      </w:r>
+      <w:r>
+        <w:t>:</w:t>
+      </w:r>
+    </w:p>
+    <w:p>
+      <w:pPr>
+        <w:pStyle w:val="Prrafodelista"/>
+        <w:numPr>
+          <w:ilvl w:val="0"/>
+          <w:numId w:val="5"/>
+        </w:numPr>
+        <w:jc w:val="both"/>
+      </w:pPr>
+      <w:r>
+        <w:t>Se aplica y tiene resultados</w:t>
+      </w:r>
+      <w:r>
+        <w:t>:</w:t>
+      </w:r>
+    </w:p>
+    <w:p>
+      <w:pPr>
+        <w:pStyle w:val="Prrafodelista"/>
+        <w:numPr>
+          <w:ilvl w:val="1"/>
+          <w:numId w:val="1"/>
+        </w:numPr>
+        <w:jc w:val="both"/>
+      </w:pPr>
+      <w:r>
+        <w:rPr>
+          <w:b/>
+          <w:bCs/>
+        </w:rPr>
+        <w:t>Dado que</w:t>
+      </w:r>
+      <w:r>
+        <w:t xml:space="preserve"> el </w:t>
+      </w:r>
+      <w:r>
+        <w:t>usuario ha seleccionado un filtro</w:t>
+      </w:r>
+    </w:p>
+    <w:p>
+      <w:pPr>
+        <w:pStyle w:val="Prrafodelista"/>
+        <w:numPr>
+          <w:ilvl w:val="1"/>
+          <w:numId w:val="1"/>
+        </w:numPr>
+        <w:jc w:val="both"/>
+      </w:pPr>
+      <w:r>
+        <w:rPr>
+          <w:b/>
+          <w:bCs/>
+        </w:rPr>
+        <w:t>cuando</w:t>
+      </w:r>
+      <w:r>
+        <w:t xml:space="preserve"> </w:t>
+      </w:r>
+      <w:r>
+        <w:t>lo trata de aplicar,</w:t>
+      </w:r>
+    </w:p>
+    <w:p>
+      <w:pPr>
+        <w:pStyle w:val="Prrafodelista"/>
+        <w:numPr>
+          <w:ilvl w:val="1"/>
+          <w:numId w:val="1"/>
+        </w:numPr>
+        <w:jc w:val="both"/>
+      </w:pPr>
+      <w:r>
+        <w:rPr>
+          <w:b/>
+          <w:bCs/>
+        </w:rPr>
+        <w:t>entonces</w:t>
+      </w:r>
+      <w:r>
+        <w:t xml:space="preserve"> </w:t>
+      </w:r>
+      <w:r>
+        <w:t>el sistema busca los mensajes siguiendo el filtro seleccionado y muestra las coincidencias</w:t>
+      </w:r>
+    </w:p>
+    <w:p>
+      <w:pPr>
+        <w:pStyle w:val="Prrafodelista"/>
+        <w:numPr>
+          <w:ilvl w:val="0"/>
+          <w:numId w:val="5"/>
+        </w:numPr>
+        <w:jc w:val="both"/>
+      </w:pPr>
+      <w:r>
+        <w:t xml:space="preserve">Se aplica y </w:t>
+      </w:r>
+      <w:r>
+        <w:t xml:space="preserve">no tiene </w:t>
+      </w:r>
+      <w:r>
+        <w:t>resultados:</w:t>
+      </w:r>
+    </w:p>
+    <w:p>
+      <w:pPr>
+        <w:pStyle w:val="Prrafodelista"/>
+        <w:numPr>
+          <w:ilvl w:val="1"/>
+          <w:numId w:val="1"/>
+        </w:numPr>
+        <w:jc w:val="both"/>
+      </w:pPr>
+      <w:r>
+        <w:rPr>
+          <w:b/>
+          <w:bCs/>
+        </w:rPr>
+        <w:t>Dado que</w:t>
+      </w:r>
+      <w:r>
+        <w:t xml:space="preserve"> el usuario ha seleccionado un filtro</w:t>
+      </w:r>
+    </w:p>
+    <w:p>
+      <w:pPr>
+        <w:pStyle w:val="Prrafodelista"/>
+        <w:numPr>
+          <w:ilvl w:val="1"/>
+          <w:numId w:val="1"/>
+        </w:numPr>
+        <w:jc w:val="both"/>
+      </w:pPr>
+      <w:r>
+        <w:rPr>
+          <w:b/>
+          <w:bCs/>
+        </w:rPr>
+        <w:t>cuando</w:t>
+      </w:r>
+      <w:r>
+        <w:t xml:space="preserve"> lo trata de aplicar,</w:t>
+      </w:r>
+    </w:p>
+    <w:p>
+      <w:pPr>
+        <w:pStyle w:val="Prrafodelista"/>
+        <w:numPr>
+          <w:ilvl w:val="1"/>
+          <w:numId w:val="1"/>
+        </w:numPr>
+        <w:jc w:val="both"/>
+      </w:pPr>
+      <w:r>
+        <w:rPr>
+          <w:b/>
+          <w:bCs/>
+        </w:rPr>
+        <w:t>entonces</w:t>
+      </w:r>
+      <w:r>
+        <w:t xml:space="preserve"> el sistema busca los mensajes siguiendo el filtro seleccionado y </w:t>
+      </w:r>
+      <w:r>
+        <w:t>muestra que no ha encontrado ninguna coincidencia</w:t>
+      </w:r>
+    </w:p>
+    <w:p>
+      <w:pPr>
+        <w:pStyle w:val="Prrafodelista"/>
+        <w:numPr>
+          <w:ilvl w:val="0"/>
+          <w:numId w:val="5"/>
+        </w:numPr>
+        <w:jc w:val="both"/>
+      </w:pPr>
+      <w:r>
+        <w:t>No se aplica</w:t>
+      </w:r>
+      <w:r>
+        <w:t>:</w:t>
+      </w:r>
+    </w:p>
+    <w:p>
+      <w:pPr>
+        <w:pStyle w:val="Prrafodelista"/>
+        <w:numPr>
+          <w:ilvl w:val="1"/>
+          <w:numId w:val="1"/>
+        </w:numPr>
+        <w:jc w:val="both"/>
+      </w:pPr>
+      <w:r>
+        <w:rPr>
+          <w:b/>
+          <w:bCs/>
+        </w:rPr>
+        <w:t>Dado que</w:t>
+      </w:r>
+      <w:r>
+        <w:t xml:space="preserve"> el usuario </w:t>
+      </w:r>
+      <w:r>
+        <w:t>no ha seleccionado un filtro</w:t>
+      </w:r>
+    </w:p>
+    <w:p>
+      <w:pPr>
+        <w:pStyle w:val="Prrafodelista"/>
+        <w:numPr>
+          <w:ilvl w:val="1"/>
+          <w:numId w:val="1"/>
+        </w:numPr>
+        <w:jc w:val="both"/>
+      </w:pPr>
+      <w:r>
+        <w:rPr>
+          <w:b/>
+          <w:bCs/>
+        </w:rPr>
+        <w:t>cuando</w:t>
+      </w:r>
+      <w:r>
+        <w:t xml:space="preserve"> </w:t>
+      </w:r>
+      <w:r>
+        <w:t>le da a aplicar</w:t>
+      </w:r>
+    </w:p>
+    <w:p>
+      <w:pPr>
+        <w:pStyle w:val="Prrafodelista"/>
+        <w:numPr>
+          <w:ilvl w:val="1"/>
+          <w:numId w:val="1"/>
+        </w:numPr>
+        <w:jc w:val="both"/>
+      </w:pPr>
+      <w:r>
+        <w:rPr>
+          <w:b/>
+          <w:bCs/>
+        </w:rPr>
+        <w:t>entonces</w:t>
+      </w:r>
+      <w:r>
+        <w:t xml:space="preserve"> el sistema </w:t>
+      </w:r>
+      <w:r>
+        <w:t>no filtra los mensajes</w:t>
+      </w:r>
+    </w:p>
+    <w:p>
+      <w:pPr>
+        <w:jc w:val="both"/>
+      </w:pPr>
+    </w:p>
+    <w:p>
+      <w:pPr>
+        <w:jc w:val="both"/>
+      </w:pPr>
+    </w:p>
+    <w:p>
+      <w:pPr>
+        <w:jc w:val="both"/>
+      </w:pPr>
+    </w:p>
+    <w:p>
+      <w:pPr>
+        <w:jc w:val="both"/>
+      </w:pPr>
+    </w:p>
+    <w:p>
+      <w:pPr>
+        <w:jc w:val="both"/>
+      </w:pPr>
+    </w:p>
+    <w:p>
+      <w:pPr>
+        <w:jc w:val="both"/>
+      </w:pPr>
+      <w:r>
+        <w:rPr>
+          <w:b/>
+          <w:bCs/>
+        </w:rPr>
+        <w:lastRenderedPageBreak/>
+        <w:t>Actividad</w:t>
+      </w:r>
+      <w:r>
+        <w:t xml:space="preserve">: </w:t>
+      </w:r>
+      <w:r>
+        <w:t>Gestionar usuario</w:t>
+      </w:r>
+    </w:p>
+    <w:p>
+      <w:pPr>
+        <w:jc w:val="both"/>
+      </w:pPr>
+      <w:r>
+        <w:rPr>
+          <w:b/>
+          <w:bCs/>
+        </w:rPr>
+        <w:t>Historia de Usuario</w:t>
+      </w:r>
+      <w:r>
+        <w:t xml:space="preserve">: </w:t>
+      </w:r>
+      <w:r>
+        <w:t>Añadir/cambiar imagen</w:t>
+      </w:r>
+    </w:p>
+    <w:p>
+      <w:pPr>
+        <w:pStyle w:val="Prrafodelista"/>
+        <w:numPr>
+          <w:ilvl w:val="0"/>
+          <w:numId w:val="1"/>
+        </w:numPr>
+        <w:jc w:val="both"/>
+      </w:pPr>
+      <w:r>
+        <w:rPr>
+          <w:b/>
+          <w:bCs/>
+        </w:rPr>
+        <w:t>Como</w:t>
+      </w:r>
+      <w:r>
+        <w:t xml:space="preserve"> usuario identificado</w:t>
+      </w:r>
+    </w:p>
+    <w:p>
+      <w:pPr>
+        <w:pStyle w:val="Prrafodelista"/>
+        <w:numPr>
+          <w:ilvl w:val="0"/>
+          <w:numId w:val="1"/>
+        </w:numPr>
+        <w:jc w:val="both"/>
+      </w:pPr>
+      <w:r>
+        <w:rPr>
+          <w:b/>
+          <w:bCs/>
+        </w:rPr>
+        <w:t>q</w:t>
+      </w:r>
+      <w:r>
+        <w:rPr>
+          <w:b/>
+          <w:bCs/>
+        </w:rPr>
+        <w:t>uiero</w:t>
+      </w:r>
+      <w:r>
+        <w:t xml:space="preserve"> aplicar </w:t>
+      </w:r>
+      <w:r>
+        <w:t>elegir una imagen</w:t>
+      </w:r>
+    </w:p>
+    <w:p>
+      <w:pPr>
+        <w:pStyle w:val="Prrafodelista"/>
+        <w:numPr>
+          <w:ilvl w:val="0"/>
+          <w:numId w:val="1"/>
+        </w:numPr>
+        <w:jc w:val="both"/>
+      </w:pPr>
+      <w:r>
+        <w:rPr>
+          <w:b/>
+          <w:bCs/>
+        </w:rPr>
+        <w:t>p</w:t>
+      </w:r>
+      <w:r>
+        <w:rPr>
+          <w:b/>
+          <w:bCs/>
+        </w:rPr>
+        <w:t>ara</w:t>
+      </w:r>
+      <w:r>
+        <w:t xml:space="preserve"> </w:t>
+      </w:r>
+      <w:r>
+        <w:t>colocarla como foto de perfil</w:t>
+      </w:r>
+    </w:p>
+    <w:p>
+      <w:pPr>
+        <w:jc w:val="both"/>
+      </w:pPr>
+      <w:r>
+        <w:rPr>
+          <w:b/>
+          <w:bCs/>
+        </w:rPr>
+        <w:t>Criterios de Aceptación</w:t>
+      </w:r>
+      <w:r>
+        <w:t>:</w:t>
+      </w:r>
+    </w:p>
+    <w:p>
+      <w:pPr>
+        <w:pStyle w:val="Prrafodelista"/>
+        <w:numPr>
+          <w:ilvl w:val="0"/>
+          <w:numId w:val="6"/>
+        </w:numPr>
+        <w:jc w:val="both"/>
+      </w:pPr>
+      <w:r>
+        <w:t>Ya existe foto de perfil</w:t>
+      </w:r>
+      <w:r>
+        <w:t>:</w:t>
+      </w:r>
+    </w:p>
+    <w:p>
+      <w:pPr>
+        <w:pStyle w:val="Prrafodelista"/>
+        <w:numPr>
+          <w:ilvl w:val="1"/>
+          <w:numId w:val="1"/>
+        </w:numPr>
+        <w:jc w:val="both"/>
+      </w:pPr>
+      <w:r>
+        <w:rPr>
+          <w:b/>
+          <w:bCs/>
+        </w:rPr>
+        <w:t>Dado que</w:t>
+      </w:r>
+      <w:r>
+        <w:t xml:space="preserve"> el usuario </w:t>
+      </w:r>
+      <w:r>
+        <w:t>selecciona una imagen nueva</w:t>
+      </w:r>
+    </w:p>
+    <w:p>
+      <w:pPr>
+        <w:pStyle w:val="Prrafodelista"/>
+        <w:numPr>
+          <w:ilvl w:val="1"/>
+          <w:numId w:val="1"/>
+        </w:numPr>
+        <w:jc w:val="both"/>
+      </w:pPr>
+      <w:r>
+        <w:rPr>
+          <w:b/>
+          <w:bCs/>
+        </w:rPr>
+        <w:t>cuando</w:t>
+      </w:r>
+      <w:r>
+        <w:t xml:space="preserve"> </w:t>
+      </w:r>
+      <w:r>
+        <w:t>trata de cambiarla,</w:t>
+      </w:r>
+    </w:p>
+    <w:p>
+      <w:pPr>
+        <w:pStyle w:val="Prrafodelista"/>
+        <w:numPr>
+          <w:ilvl w:val="1"/>
+          <w:numId w:val="1"/>
+        </w:numPr>
+        <w:jc w:val="both"/>
+      </w:pPr>
+      <w:r>
+        <w:rPr>
+          <w:b/>
+          <w:bCs/>
+        </w:rPr>
+        <w:t>entonces</w:t>
+      </w:r>
+      <w:r>
+        <w:t xml:space="preserve"> </w:t>
+      </w:r>
+      <w:r>
+        <w:t>el sistema reemplaza la foto anterior con esta nueva</w:t>
+      </w:r>
+    </w:p>
+    <w:p>
+      <w:pPr>
+        <w:pStyle w:val="Prrafodelista"/>
+        <w:numPr>
+          <w:ilvl w:val="0"/>
+          <w:numId w:val="6"/>
+        </w:numPr>
+        <w:jc w:val="both"/>
+      </w:pPr>
+      <w:r>
+        <w:t>No había foto de perfil</w:t>
+      </w:r>
+      <w:r>
+        <w:t>:</w:t>
+      </w:r>
+    </w:p>
+    <w:p>
+      <w:pPr>
+        <w:pStyle w:val="Prrafodelista"/>
+        <w:numPr>
+          <w:ilvl w:val="1"/>
+          <w:numId w:val="1"/>
+        </w:numPr>
+        <w:jc w:val="both"/>
+      </w:pPr>
+      <w:r>
+        <w:rPr>
+          <w:b/>
+          <w:bCs/>
+        </w:rPr>
+        <w:t>Dado que</w:t>
+      </w:r>
+      <w:r>
+        <w:t xml:space="preserve"> el usuario </w:t>
+      </w:r>
+      <w:r>
+        <w:t>selecciona una imagen</w:t>
+      </w:r>
+    </w:p>
+    <w:p>
+      <w:pPr>
+        <w:pStyle w:val="Prrafodelista"/>
+        <w:numPr>
+          <w:ilvl w:val="1"/>
+          <w:numId w:val="1"/>
+        </w:numPr>
+        <w:jc w:val="both"/>
+      </w:pPr>
+      <w:r>
+        <w:rPr>
+          <w:b/>
+          <w:bCs/>
+        </w:rPr>
+        <w:t>cuando</w:t>
+      </w:r>
+      <w:r>
+        <w:t xml:space="preserve"> </w:t>
+      </w:r>
+      <w:r>
+        <w:t>trata de añadirla</w:t>
+      </w:r>
+    </w:p>
+    <w:p>
+      <w:pPr>
+        <w:pStyle w:val="Prrafodelista"/>
+        <w:numPr>
+          <w:ilvl w:val="1"/>
+          <w:numId w:val="1"/>
+        </w:numPr>
+        <w:jc w:val="both"/>
+      </w:pPr>
+      <w:r>
+        <w:rPr>
+          <w:b/>
+          <w:bCs/>
+        </w:rPr>
+        <w:t>entonces</w:t>
+      </w:r>
+      <w:r>
+        <w:t xml:space="preserve"> el sistema </w:t>
+      </w:r>
+      <w:r>
+        <w:t>la asigna como foto de perfil</w:t>
+      </w:r>
+    </w:p>
+    <w:p>
+      <w:pPr>
+        <w:pStyle w:val="Prrafodelista"/>
+        <w:numPr>
+          <w:ilvl w:val="0"/>
+          <w:numId w:val="6"/>
+        </w:numPr>
+        <w:jc w:val="both"/>
+      </w:pPr>
+      <w:r>
+        <w:t>La imagen tiene un tamaño incorrecto</w:t>
+      </w:r>
+      <w:r>
+        <w:t>:</w:t>
+      </w:r>
+    </w:p>
+    <w:p>
+      <w:pPr>
+        <w:pStyle w:val="Prrafodelista"/>
+        <w:numPr>
+          <w:ilvl w:val="1"/>
+          <w:numId w:val="1"/>
+        </w:numPr>
+        <w:jc w:val="both"/>
+      </w:pPr>
+      <w:r>
+        <w:rPr>
+          <w:b/>
+          <w:bCs/>
+        </w:rPr>
+        <w:t>Dado que</w:t>
+      </w:r>
+      <w:r>
+        <w:t xml:space="preserve"> el usuario </w:t>
+      </w:r>
+      <w:r>
+        <w:t>selecciona una imagen</w:t>
+      </w:r>
+    </w:p>
+    <w:p>
+      <w:pPr>
+        <w:pStyle w:val="Prrafodelista"/>
+        <w:numPr>
+          <w:ilvl w:val="1"/>
+          <w:numId w:val="1"/>
+        </w:numPr>
+        <w:jc w:val="both"/>
+      </w:pPr>
+      <w:r>
+        <w:rPr>
+          <w:b/>
+          <w:bCs/>
+        </w:rPr>
+        <w:t>cuando</w:t>
+      </w:r>
+      <w:r>
+        <w:t xml:space="preserve"> </w:t>
+      </w:r>
+      <w:r>
+        <w:t>trata de añadirla</w:t>
+      </w:r>
+    </w:p>
+    <w:p>
+      <w:pPr>
+        <w:pStyle w:val="Prrafodelista"/>
+        <w:numPr>
+          <w:ilvl w:val="1"/>
+          <w:numId w:val="1"/>
+        </w:numPr>
+        <w:jc w:val="both"/>
+      </w:pPr>
+      <w:r>
+        <w:rPr>
+          <w:b/>
+          <w:bCs/>
+        </w:rPr>
+        <w:t>entonces</w:t>
+      </w:r>
+      <w:r>
+        <w:t xml:space="preserve"> el sistema </w:t>
+      </w:r>
+      <w:r>
+        <w:t>muestra un mensaje de error o trata de modificar su tamaño para poder añadirla</w:t>
+      </w:r>
+    </w:p>
+    <w:p>
+      <w:pPr>
+        <w:pStyle w:val="Prrafodelista"/>
+        <w:numPr>
+          <w:ilvl w:val="0"/>
+          <w:numId w:val="6"/>
+        </w:numPr>
+        <w:jc w:val="both"/>
+      </w:pPr>
+      <w:r>
+        <w:t>No ha seleccionado una imagen:</w:t>
+      </w:r>
+    </w:p>
+    <w:p>
+      <w:pPr>
+        <w:pStyle w:val="Prrafodelista"/>
+        <w:numPr>
+          <w:ilvl w:val="1"/>
+          <w:numId w:val="1"/>
+        </w:numPr>
+        <w:jc w:val="both"/>
+      </w:pPr>
+      <w:r>
+        <w:rPr>
+          <w:b/>
+          <w:bCs/>
+        </w:rPr>
+        <w:t>Dado que</w:t>
+      </w:r>
+      <w:r>
+        <w:t xml:space="preserve"> el usuario no ha seleccionado una imagen</w:t>
+      </w:r>
+    </w:p>
+    <w:p>
+      <w:pPr>
+        <w:pStyle w:val="Prrafodelista"/>
+        <w:numPr>
+          <w:ilvl w:val="1"/>
+          <w:numId w:val="1"/>
+        </w:numPr>
+        <w:jc w:val="both"/>
+      </w:pPr>
+      <w:r>
+        <w:rPr>
+          <w:b/>
+          <w:bCs/>
+        </w:rPr>
+        <w:t>c</w:t>
+      </w:r>
+      <w:r>
+        <w:rPr>
+          <w:b/>
+          <w:bCs/>
+        </w:rPr>
+        <w:t>uando</w:t>
+      </w:r>
+      <w:r>
+        <w:t xml:space="preserve"> trata de añadirla,</w:t>
+      </w:r>
+    </w:p>
+    <w:p>
+      <w:pPr>
+        <w:pStyle w:val="Prrafodelista"/>
+        <w:numPr>
+          <w:ilvl w:val="1"/>
+          <w:numId w:val="1"/>
+        </w:numPr>
+        <w:jc w:val="both"/>
+      </w:pPr>
+      <w:r>
+        <w:rPr>
+          <w:b/>
+          <w:bCs/>
+        </w:rPr>
+        <w:t>e</w:t>
+      </w:r>
+      <w:r>
+        <w:rPr>
+          <w:b/>
+          <w:bCs/>
+        </w:rPr>
+        <w:t>ntonces</w:t>
+      </w:r>
+      <w:r>
+        <w:t xml:space="preserve"> el sistema muestra un mensaje de error</w:t>
+      </w:r>
+    </w:p>
+    <w:p>
+      <w:pPr>
+        <w:jc w:val="both"/>
+      </w:pPr>
     </w:p>
     <w:sectPr>
       <w:pgSz w:w="11906" w:h="16838"/>
@@ -410,11 +2262,379 @@
       </w:rPr>
     </w:lvl>
   </w:abstractNum>
+  <w:abstractNum w:abstractNumId="2" w15:restartNumberingAfterBreak="0">
+    <w:nsid w:val="34BE29DE"/>
+    <w:multiLevelType w:val="hybridMultilevel"/>
+    <w:tmpl w:val="BD76E808"/>
+    <w:lvl w:ilvl="0" w:tplc="0C0A000F">
+      <w:start w:val="1"/>
+      <w:numFmt w:val="decimal"/>
+      <w:lvlText w:val="%1."/>
+      <w:lvlJc w:val="left"/>
+      <w:pPr>
+        <w:ind w:left="720" w:hanging="360"/>
+      </w:pPr>
+      <w:rPr>
+        <w:rFonts w:hint="default"/>
+      </w:rPr>
+    </w:lvl>
+    <w:lvl w:ilvl="1" w:tplc="0C0A0019" w:tentative="1">
+      <w:start w:val="1"/>
+      <w:numFmt w:val="lowerLetter"/>
+      <w:lvlText w:val="%2."/>
+      <w:lvlJc w:val="left"/>
+      <w:pPr>
+        <w:ind w:left="1440" w:hanging="360"/>
+      </w:pPr>
+    </w:lvl>
+    <w:lvl w:ilvl="2" w:tplc="0C0A001B" w:tentative="1">
+      <w:start w:val="1"/>
+      <w:numFmt w:val="lowerRoman"/>
+      <w:lvlText w:val="%3."/>
+      <w:lvlJc w:val="right"/>
+      <w:pPr>
+        <w:ind w:left="2160" w:hanging="180"/>
+      </w:pPr>
+    </w:lvl>
+    <w:lvl w:ilvl="3" w:tplc="0C0A000F" w:tentative="1">
+      <w:start w:val="1"/>
+      <w:numFmt w:val="decimal"/>
+      <w:lvlText w:val="%4."/>
+      <w:lvlJc w:val="left"/>
+      <w:pPr>
+        <w:ind w:left="2880" w:hanging="360"/>
+      </w:pPr>
+    </w:lvl>
+    <w:lvl w:ilvl="4" w:tplc="0C0A0019" w:tentative="1">
+      <w:start w:val="1"/>
+      <w:numFmt w:val="lowerLetter"/>
+      <w:lvlText w:val="%5."/>
+      <w:lvlJc w:val="left"/>
+      <w:pPr>
+        <w:ind w:left="3600" w:hanging="360"/>
+      </w:pPr>
+    </w:lvl>
+    <w:lvl w:ilvl="5" w:tplc="0C0A001B" w:tentative="1">
+      <w:start w:val="1"/>
+      <w:numFmt w:val="lowerRoman"/>
+      <w:lvlText w:val="%6."/>
+      <w:lvlJc w:val="right"/>
+      <w:pPr>
+        <w:ind w:left="4320" w:hanging="180"/>
+      </w:pPr>
+    </w:lvl>
+    <w:lvl w:ilvl="6" w:tplc="0C0A000F" w:tentative="1">
+      <w:start w:val="1"/>
+      <w:numFmt w:val="decimal"/>
+      <w:lvlText w:val="%7."/>
+      <w:lvlJc w:val="left"/>
+      <w:pPr>
+        <w:ind w:left="5040" w:hanging="360"/>
+      </w:pPr>
+    </w:lvl>
+    <w:lvl w:ilvl="7" w:tplc="0C0A0019" w:tentative="1">
+      <w:start w:val="1"/>
+      <w:numFmt w:val="lowerLetter"/>
+      <w:lvlText w:val="%8."/>
+      <w:lvlJc w:val="left"/>
+      <w:pPr>
+        <w:ind w:left="5760" w:hanging="360"/>
+      </w:pPr>
+    </w:lvl>
+    <w:lvl w:ilvl="8" w:tplc="0C0A001B" w:tentative="1">
+      <w:start w:val="1"/>
+      <w:numFmt w:val="lowerRoman"/>
+      <w:lvlText w:val="%9."/>
+      <w:lvlJc w:val="right"/>
+      <w:pPr>
+        <w:ind w:left="6480" w:hanging="180"/>
+      </w:pPr>
+    </w:lvl>
+  </w:abstractNum>
+  <w:abstractNum w:abstractNumId="3" w15:restartNumberingAfterBreak="0">
+    <w:nsid w:val="3CE14AE6"/>
+    <w:multiLevelType w:val="hybridMultilevel"/>
+    <w:tmpl w:val="50DA4CF2"/>
+    <w:lvl w:ilvl="0" w:tplc="0C0A000F">
+      <w:start w:val="1"/>
+      <w:numFmt w:val="decimal"/>
+      <w:lvlText w:val="%1."/>
+      <w:lvlJc w:val="left"/>
+      <w:pPr>
+        <w:ind w:left="720" w:hanging="360"/>
+      </w:pPr>
+      <w:rPr>
+        <w:rFonts w:hint="default"/>
+      </w:rPr>
+    </w:lvl>
+    <w:lvl w:ilvl="1" w:tplc="0C0A0019" w:tentative="1">
+      <w:start w:val="1"/>
+      <w:numFmt w:val="lowerLetter"/>
+      <w:lvlText w:val="%2."/>
+      <w:lvlJc w:val="left"/>
+      <w:pPr>
+        <w:ind w:left="1440" w:hanging="360"/>
+      </w:pPr>
+    </w:lvl>
+    <w:lvl w:ilvl="2" w:tplc="0C0A001B" w:tentative="1">
+      <w:start w:val="1"/>
+      <w:numFmt w:val="lowerRoman"/>
+      <w:lvlText w:val="%3."/>
+      <w:lvlJc w:val="right"/>
+      <w:pPr>
+        <w:ind w:left="2160" w:hanging="180"/>
+      </w:pPr>
+    </w:lvl>
+    <w:lvl w:ilvl="3" w:tplc="0C0A000F" w:tentative="1">
+      <w:start w:val="1"/>
+      <w:numFmt w:val="decimal"/>
+      <w:lvlText w:val="%4."/>
+      <w:lvlJc w:val="left"/>
+      <w:pPr>
+        <w:ind w:left="2880" w:hanging="360"/>
+      </w:pPr>
+    </w:lvl>
+    <w:lvl w:ilvl="4" w:tplc="0C0A0019" w:tentative="1">
+      <w:start w:val="1"/>
+      <w:numFmt w:val="lowerLetter"/>
+      <w:lvlText w:val="%5."/>
+      <w:lvlJc w:val="left"/>
+      <w:pPr>
+        <w:ind w:left="3600" w:hanging="360"/>
+      </w:pPr>
+    </w:lvl>
+    <w:lvl w:ilvl="5" w:tplc="0C0A001B" w:tentative="1">
+      <w:start w:val="1"/>
+      <w:numFmt w:val="lowerRoman"/>
+      <w:lvlText w:val="%6."/>
+      <w:lvlJc w:val="right"/>
+      <w:pPr>
+        <w:ind w:left="4320" w:hanging="180"/>
+      </w:pPr>
+    </w:lvl>
+    <w:lvl w:ilvl="6" w:tplc="0C0A000F" w:tentative="1">
+      <w:start w:val="1"/>
+      <w:numFmt w:val="decimal"/>
+      <w:lvlText w:val="%7."/>
+      <w:lvlJc w:val="left"/>
+      <w:pPr>
+        <w:ind w:left="5040" w:hanging="360"/>
+      </w:pPr>
+    </w:lvl>
+    <w:lvl w:ilvl="7" w:tplc="0C0A0019" w:tentative="1">
+      <w:start w:val="1"/>
+      <w:numFmt w:val="lowerLetter"/>
+      <w:lvlText w:val="%8."/>
+      <w:lvlJc w:val="left"/>
+      <w:pPr>
+        <w:ind w:left="5760" w:hanging="360"/>
+      </w:pPr>
+    </w:lvl>
+    <w:lvl w:ilvl="8" w:tplc="0C0A001B" w:tentative="1">
+      <w:start w:val="1"/>
+      <w:numFmt w:val="lowerRoman"/>
+      <w:lvlText w:val="%9."/>
+      <w:lvlJc w:val="right"/>
+      <w:pPr>
+        <w:ind w:left="6480" w:hanging="180"/>
+      </w:pPr>
+    </w:lvl>
+  </w:abstractNum>
+  <w:abstractNum w:abstractNumId="4" w15:restartNumberingAfterBreak="0">
+    <w:nsid w:val="65722387"/>
+    <w:multiLevelType w:val="hybridMultilevel"/>
+    <w:tmpl w:val="8D1E1C3A"/>
+    <w:lvl w:ilvl="0" w:tplc="0C0A000F">
+      <w:start w:val="1"/>
+      <w:numFmt w:val="decimal"/>
+      <w:lvlText w:val="%1."/>
+      <w:lvlJc w:val="left"/>
+      <w:pPr>
+        <w:ind w:left="720" w:hanging="360"/>
+      </w:pPr>
+      <w:rPr>
+        <w:rFonts w:hint="default"/>
+      </w:rPr>
+    </w:lvl>
+    <w:lvl w:ilvl="1" w:tplc="0C0A0019" w:tentative="1">
+      <w:start w:val="1"/>
+      <w:numFmt w:val="lowerLetter"/>
+      <w:lvlText w:val="%2."/>
+      <w:lvlJc w:val="left"/>
+      <w:pPr>
+        <w:ind w:left="1440" w:hanging="360"/>
+      </w:pPr>
+    </w:lvl>
+    <w:lvl w:ilvl="2" w:tplc="0C0A001B" w:tentative="1">
+      <w:start w:val="1"/>
+      <w:numFmt w:val="lowerRoman"/>
+      <w:lvlText w:val="%3."/>
+      <w:lvlJc w:val="right"/>
+      <w:pPr>
+        <w:ind w:left="2160" w:hanging="180"/>
+      </w:pPr>
+    </w:lvl>
+    <w:lvl w:ilvl="3" w:tplc="0C0A000F" w:tentative="1">
+      <w:start w:val="1"/>
+      <w:numFmt w:val="decimal"/>
+      <w:lvlText w:val="%4."/>
+      <w:lvlJc w:val="left"/>
+      <w:pPr>
+        <w:ind w:left="2880" w:hanging="360"/>
+      </w:pPr>
+    </w:lvl>
+    <w:lvl w:ilvl="4" w:tplc="0C0A0019" w:tentative="1">
+      <w:start w:val="1"/>
+      <w:numFmt w:val="lowerLetter"/>
+      <w:lvlText w:val="%5."/>
+      <w:lvlJc w:val="left"/>
+      <w:pPr>
+        <w:ind w:left="3600" w:hanging="360"/>
+      </w:pPr>
+    </w:lvl>
+    <w:lvl w:ilvl="5" w:tplc="0C0A001B" w:tentative="1">
+      <w:start w:val="1"/>
+      <w:numFmt w:val="lowerRoman"/>
+      <w:lvlText w:val="%6."/>
+      <w:lvlJc w:val="right"/>
+      <w:pPr>
+        <w:ind w:left="4320" w:hanging="180"/>
+      </w:pPr>
+    </w:lvl>
+    <w:lvl w:ilvl="6" w:tplc="0C0A000F" w:tentative="1">
+      <w:start w:val="1"/>
+      <w:numFmt w:val="decimal"/>
+      <w:lvlText w:val="%7."/>
+      <w:lvlJc w:val="left"/>
+      <w:pPr>
+        <w:ind w:left="5040" w:hanging="360"/>
+      </w:pPr>
+    </w:lvl>
+    <w:lvl w:ilvl="7" w:tplc="0C0A0019" w:tentative="1">
+      <w:start w:val="1"/>
+      <w:numFmt w:val="lowerLetter"/>
+      <w:lvlText w:val="%8."/>
+      <w:lvlJc w:val="left"/>
+      <w:pPr>
+        <w:ind w:left="5760" w:hanging="360"/>
+      </w:pPr>
+    </w:lvl>
+    <w:lvl w:ilvl="8" w:tplc="0C0A001B" w:tentative="1">
+      <w:start w:val="1"/>
+      <w:numFmt w:val="lowerRoman"/>
+      <w:lvlText w:val="%9."/>
+      <w:lvlJc w:val="right"/>
+      <w:pPr>
+        <w:ind w:left="6480" w:hanging="180"/>
+      </w:pPr>
+    </w:lvl>
+  </w:abstractNum>
+  <w:abstractNum w:abstractNumId="5" w15:restartNumberingAfterBreak="0">
+    <w:nsid w:val="7C355AA5"/>
+    <w:multiLevelType w:val="hybridMultilevel"/>
+    <w:tmpl w:val="63A87C28"/>
+    <w:lvl w:ilvl="0" w:tplc="0C0A000F">
+      <w:start w:val="1"/>
+      <w:numFmt w:val="decimal"/>
+      <w:lvlText w:val="%1."/>
+      <w:lvlJc w:val="left"/>
+      <w:pPr>
+        <w:ind w:left="720" w:hanging="360"/>
+      </w:pPr>
+      <w:rPr>
+        <w:rFonts w:hint="default"/>
+      </w:rPr>
+    </w:lvl>
+    <w:lvl w:ilvl="1" w:tplc="0C0A0019">
+      <w:start w:val="1"/>
+      <w:numFmt w:val="lowerLetter"/>
+      <w:lvlText w:val="%2."/>
+      <w:lvlJc w:val="left"/>
+      <w:pPr>
+        <w:ind w:left="1440" w:hanging="360"/>
+      </w:pPr>
+    </w:lvl>
+    <w:lvl w:ilvl="2" w:tplc="0C0A001B" w:tentative="1">
+      <w:start w:val="1"/>
+      <w:numFmt w:val="lowerRoman"/>
+      <w:lvlText w:val="%3."/>
+      <w:lvlJc w:val="right"/>
+      <w:pPr>
+        <w:ind w:left="2160" w:hanging="180"/>
+      </w:pPr>
+    </w:lvl>
+    <w:lvl w:ilvl="3" w:tplc="0C0A000F" w:tentative="1">
+      <w:start w:val="1"/>
+      <w:numFmt w:val="decimal"/>
+      <w:lvlText w:val="%4."/>
+      <w:lvlJc w:val="left"/>
+      <w:pPr>
+        <w:ind w:left="2880" w:hanging="360"/>
+      </w:pPr>
+    </w:lvl>
+    <w:lvl w:ilvl="4" w:tplc="0C0A0019" w:tentative="1">
+      <w:start w:val="1"/>
+      <w:numFmt w:val="lowerLetter"/>
+      <w:lvlText w:val="%5."/>
+      <w:lvlJc w:val="left"/>
+      <w:pPr>
+        <w:ind w:left="3600" w:hanging="360"/>
+      </w:pPr>
+    </w:lvl>
+    <w:lvl w:ilvl="5" w:tplc="0C0A001B" w:tentative="1">
+      <w:start w:val="1"/>
+      <w:numFmt w:val="lowerRoman"/>
+      <w:lvlText w:val="%6."/>
+      <w:lvlJc w:val="right"/>
+      <w:pPr>
+        <w:ind w:left="4320" w:hanging="180"/>
+      </w:pPr>
+    </w:lvl>
+    <w:lvl w:ilvl="6" w:tplc="0C0A000F" w:tentative="1">
+      <w:start w:val="1"/>
+      <w:numFmt w:val="decimal"/>
+      <w:lvlText w:val="%7."/>
+      <w:lvlJc w:val="left"/>
+      <w:pPr>
+        <w:ind w:left="5040" w:hanging="360"/>
+      </w:pPr>
+    </w:lvl>
+    <w:lvl w:ilvl="7" w:tplc="0C0A0019" w:tentative="1">
+      <w:start w:val="1"/>
+      <w:numFmt w:val="lowerLetter"/>
+      <w:lvlText w:val="%8."/>
+      <w:lvlJc w:val="left"/>
+      <w:pPr>
+        <w:ind w:left="5760" w:hanging="360"/>
+      </w:pPr>
+    </w:lvl>
+    <w:lvl w:ilvl="8" w:tplc="0C0A001B" w:tentative="1">
+      <w:start w:val="1"/>
+      <w:numFmt w:val="lowerRoman"/>
+      <w:lvlText w:val="%9."/>
+      <w:lvlJc w:val="right"/>
+      <w:pPr>
+        <w:ind w:left="6480" w:hanging="180"/>
+      </w:pPr>
+    </w:lvl>
+  </w:abstractNum>
   <w:num w:numId="1" w16cid:durableId="476652254">
     <w:abstractNumId w:val="1"/>
   </w:num>
   <w:num w:numId="2" w16cid:durableId="80764613">
     <w:abstractNumId w:val="0"/>
+  </w:num>
+  <w:num w:numId="3" w16cid:durableId="516120030">
+    <w:abstractNumId w:val="4"/>
+  </w:num>
+  <w:num w:numId="4" w16cid:durableId="445587439">
+    <w:abstractNumId w:val="2"/>
+  </w:num>
+  <w:num w:numId="5" w16cid:durableId="2008745738">
+    <w:abstractNumId w:val="3"/>
+  </w:num>
+  <w:num w:numId="6" w16cid:durableId="383675617">
+    <w:abstractNumId w:val="5"/>
   </w:num>
 </w:numbering>
 </file>
@@ -1022,7 +3242,6 @@
   <w:style w:type="character" w:default="1" w:styleId="Fuentedeprrafopredeter">
     <w:name w:val="Default Paragraph Font"/>
     <w:uiPriority w:val="1"/>
-    <w:semiHidden/>
     <w:unhideWhenUsed/>
   </w:style>
   <w:style w:type="table" w:default="1" w:styleId="Tablanormal">

</xml_diff>